<commit_message>
Adjusted syllabus, draft of four more lectures
</commit_message>
<xml_diff>
--- a/W26-Phil342-site/syllabus-W26-342.docx
+++ b/W26-Phil342-site/syllabus-W26-342.docx
@@ -963,7 +963,7 @@
         <w:t xml:space="preserve">Opinion Pooling</w:t>
       </w:r>
       <w:r>
-        <w:t xml:space="preserve">, Ch. 1 and sections 2.1-2.2.</w:t>
+        <w:t xml:space="preserve">, Ch. 1 and section 2.1.</w:t>
       </w:r>
       <w:r>
         <w:br/>
@@ -1244,7 +1244,7 @@
         <w:t xml:space="preserve">: Linear and Geometric Pooling</w:t>
       </w:r>
       <w:r>
-        <w:t xml:space="preserve"> </w:t>
+        <w:br/>
       </w:r>
       <w:r>
         <w:rPr>
@@ -1267,7 +1267,7 @@
         <w:t xml:space="preserve">Opinion Pooling</w:t>
       </w:r>
       <w:r>
-        <w:t xml:space="preserve">, sections 4.1-4.2.</w:t>
+        <w:t xml:space="preserve">, section 4.1.</w:t>
       </w:r>
       <w:r>
         <w:br/>
@@ -1410,7 +1410,7 @@
         <w:t xml:space="preserve">Opinion Pooling</w:t>
       </w:r>
       <w:r>
-        <w:t xml:space="preserve">, section 4.3</w:t>
+        <w:t xml:space="preserve">, sections 4.2-4.3</w:t>
       </w:r>
     </w:p>
     <w:bookmarkEnd w:id="61"/>

</xml_diff>

<commit_message>
Added strategy guide for 342
</commit_message>
<xml_diff>
--- a/W26-Phil342-site/syllabus-W26-342.docx
+++ b/W26-Phil342-site/syllabus-W26-342.docx
@@ -1976,19 +1976,6 @@
           <w:t xml:space="preserve">Iterated Prisoner’s Dilemma contains strategies that dominate any evolutionary opponent</w:t>
         </w:r>
       </w:hyperlink>
-      <w:r>
-        <w:br/>
-      </w:r>
-      <w:r>
-        <w:rPr>
-          <w:b/>
-          <w:bCs/>
-        </w:rPr>
-        <w:t xml:space="preserve">Assignment</w:t>
-      </w:r>
-      <w:r>
-        <w:t xml:space="preserve">: Third short assignment due Thursday, March 19 at 5pm.</w:t>
-      </w:r>
     </w:p>
     <w:bookmarkEnd w:id="81"/>
     <w:bookmarkEnd w:id="82"/>
@@ -2122,6 +2109,21 @@
         </w:r>
       </w:hyperlink>
     </w:p>
+    <w:p>
+      <w:pPr>
+        <w:pStyle w:val="BodyText"/>
+      </w:pPr>
+      <w:r>
+        <w:rPr>
+          <w:b/>
+          <w:bCs/>
+        </w:rPr>
+        <w:t xml:space="preserve">Assignment</w:t>
+      </w:r>
+      <w:r>
+        <w:t xml:space="preserve">: Third short assignment due Thursday, March 26 at 5pm.</w:t>
+      </w:r>
+    </w:p>
     <w:bookmarkEnd w:id="87"/>
     <w:bookmarkEnd w:id="88"/>
     <w:bookmarkStart w:id="93" w:name="Xa733ee59e25198623d69d330a796641ed718632"/>
@@ -2289,6 +2291,19 @@
       <w:r>
         <w:t xml:space="preserve">.</w:t>
       </w:r>
+      <w:r>
+        <w:br/>
+      </w:r>
+      <w:r>
+        <w:rPr>
+          <w:b/>
+          <w:bCs/>
+        </w:rPr>
+        <w:t xml:space="preserve">Assignment</w:t>
+      </w:r>
+      <w:r>
+        <w:t xml:space="preserve">: Second part of third short assignment due Thursday, April 02 at 5pm.</w:t>
+      </w:r>
     </w:p>
     <w:bookmarkEnd w:id="92"/>
     <w:bookmarkEnd w:id="93"/>
@@ -2485,19 +2500,6 @@
           <w:t xml:space="preserve">Structural causes of citation gaps</w:t>
         </w:r>
       </w:hyperlink>
-      <w:r>
-        <w:br/>
-      </w:r>
-      <w:r>
-        <w:rPr>
-          <w:b/>
-          <w:bCs/>
-        </w:rPr>
-        <w:t xml:space="preserve">Assignment</w:t>
-      </w:r>
-      <w:r>
-        <w:t xml:space="preserve">: Fourth short assignment due Thursday, April 09 at 5pm.</w:t>
-      </w:r>
     </w:p>
     <w:bookmarkEnd w:id="98"/>
     <w:bookmarkEnd w:id="99"/>
@@ -2674,6 +2676,21 @@
         <w:pStyle w:val="FirstParagraph"/>
       </w:pPr>
       <w:r>
+        <w:rPr>
+          <w:b/>
+          <w:bCs/>
+        </w:rPr>
+        <w:t xml:space="preserve">Assignment</w:t>
+      </w:r>
+      <w:r>
+        <w:t xml:space="preserve">: Fourth short assignment due Thursday, April 16 at 5pm.</w:t>
+      </w:r>
+    </w:p>
+    <w:p>
+      <w:pPr>
+        <w:pStyle w:val="BodyText"/>
+      </w:pPr>
+      <w:r>
         <w:t xml:space="preserve">There will be a revision class on Monday, April 20, with no new material, to go over any questions people have about the final essay.</w:t>
       </w:r>
     </w:p>
@@ -2689,7 +2706,7 @@
         <w:t xml:space="preserve">FINAL ESSAY</w:t>
       </w:r>
       <w:r>
-        <w:t xml:space="preserve">: Due Tuesday, April 21 at 5pm.</w:t>
+        <w:t xml:space="preserve">: Due Thursday, April 23 at 5pm.</w:t>
       </w:r>
     </w:p>
     <w:p>

</xml_diff>